<commit_message>
Fix MySQL scripts after defence for Task 5
Отказ по пенсионному возрасту переведён с предупреждения на ошибку,
дата регистрации проставляется триггером вместо DEFAULT (CURRENT_DATE),
кодировка базы utf8mb4_general_ci, в начало скриптов добавлен SET NAMES:
без него клиент читал файл не как UTF-8 и кириллица в имени базы ломалась.
</commit_message>
<xml_diff>
--- a/Task 5th MySQL Create and Modify/Solution/Отчёт по ПР №5.docx
+++ b/Task 5th MySQL Create and Modify/Solution/Отчёт по ПР №5.docx
@@ -1466,49 +1466,91 @@
           <w:rFonts w:ascii="Courier New" w:hAnsi="Courier New" w:eastAsia="Courier New"/>
           <w:sz w:val="18"/>
         </w:rPr>
-        <w:t>-- Требуется версия сервера, которая проверяет CHECK: MySQL от 8.0.16 или</w:t>
-      </w:r>
-    </w:p>
-    <w:p>
-      <w:pPr>
-        <w:spacing w:line="240" w:lineRule="auto" w:before="0" w:after="0"/>
-        <w:ind w:firstLine="0" w:left="0"/>
-        <w:jc w:val="left"/>
-      </w:pPr>
-      <w:r>
-        <w:rPr>
-          <w:rFonts w:ascii="Courier New" w:hAnsi="Courier New" w:eastAsia="Courier New"/>
-          <w:sz w:val="18"/>
-        </w:rPr>
-        <w:t>-- MariaDB от 10.2.1. Более старый MySQL разбирает CHECK и молча игнорирует,</w:t>
-      </w:r>
-    </w:p>
-    <w:p>
-      <w:pPr>
-        <w:spacing w:line="240" w:lineRule="auto" w:before="0" w:after="0"/>
-        <w:ind w:firstLine="0" w:left="0"/>
-        <w:jc w:val="left"/>
-      </w:pPr>
-      <w:r>
-        <w:rPr>
-          <w:rFonts w:ascii="Courier New" w:hAnsi="Courier New" w:eastAsia="Courier New"/>
-          <w:sz w:val="18"/>
-        </w:rPr>
-        <w:t>-- и тогда половина ограничений задания работать не будет. Версия видна на</w:t>
-      </w:r>
-    </w:p>
-    <w:p>
-      <w:pPr>
-        <w:spacing w:line="240" w:lineRule="auto" w:before="0" w:after="0"/>
-        <w:ind w:firstLine="0" w:left="0"/>
-        <w:jc w:val="left"/>
-      </w:pPr>
-      <w:r>
-        <w:rPr>
-          <w:rFonts w:ascii="Courier New" w:hAnsi="Courier New" w:eastAsia="Courier New"/>
-          <w:sz w:val="18"/>
-        </w:rPr>
-        <w:t>-- главной странице phpMyAdmin.</w:t>
+        <w:t>-- Сервер должен быть именно MySQL. В XAMPP под капотом стоит MariaDB, и она не</w:t>
+      </w:r>
+    </w:p>
+    <w:p>
+      <w:pPr>
+        <w:spacing w:line="240" w:lineRule="auto" w:before="0" w:after="0"/>
+        <w:ind w:firstLine="0" w:left="0"/>
+        <w:jc w:val="left"/>
+      </w:pPr>
+      <w:r>
+        <w:rPr>
+          <w:rFonts w:ascii="Courier New" w:hAnsi="Courier New" w:eastAsia="Courier New"/>
+          <w:sz w:val="18"/>
+        </w:rPr>
+        <w:t>-- принимает кириллицу в имени базы, а методичка требует torgash_ФАМИЛИЯ. Если</w:t>
+      </w:r>
+    </w:p>
+    <w:p>
+      <w:pPr>
+        <w:spacing w:line="240" w:lineRule="auto" w:before="0" w:after="0"/>
+        <w:ind w:firstLine="0" w:left="0"/>
+        <w:jc w:val="left"/>
+      </w:pPr>
+      <w:r>
+        <w:rPr>
+          <w:rFonts w:ascii="Courier New" w:hAnsi="Courier New" w:eastAsia="Courier New"/>
+          <w:sz w:val="18"/>
+        </w:rPr>
+        <w:t>-- сервер сменить нельзя, останется только латинское имя torgash_Kholkin.</w:t>
+      </w:r>
+    </w:p>
+    <w:p>
+      <w:pPr>
+        <w:spacing w:line="240" w:lineRule="auto" w:before="0" w:after="0"/>
+        <w:ind w:firstLine="0" w:left="0"/>
+        <w:jc w:val="left"/>
+      </w:pPr>
+      <w:r>
+        <w:rPr>
+          <w:rFonts w:ascii="Courier New" w:hAnsi="Courier New" w:eastAsia="Courier New"/>
+          <w:sz w:val="18"/>
+        </w:rPr>
+        <w:t>--</w:t>
+      </w:r>
+    </w:p>
+    <w:p>
+      <w:pPr>
+        <w:spacing w:line="240" w:lineRule="auto" w:before="0" w:after="0"/>
+        <w:ind w:firstLine="0" w:left="0"/>
+        <w:jc w:val="left"/>
+      </w:pPr>
+      <w:r>
+        <w:rPr>
+          <w:rFonts w:ascii="Courier New" w:hAnsi="Courier New" w:eastAsia="Courier New"/>
+          <w:sz w:val="18"/>
+        </w:rPr>
+        <w:t>-- Нужна версия, которая проверяет CHECK: MySQL от 8.0.16. Более старый MySQL</w:t>
+      </w:r>
+    </w:p>
+    <w:p>
+      <w:pPr>
+        <w:spacing w:line="240" w:lineRule="auto" w:before="0" w:after="0"/>
+        <w:ind w:firstLine="0" w:left="0"/>
+        <w:jc w:val="left"/>
+      </w:pPr>
+      <w:r>
+        <w:rPr>
+          <w:rFonts w:ascii="Courier New" w:hAnsi="Courier New" w:eastAsia="Courier New"/>
+          <w:sz w:val="18"/>
+        </w:rPr>
+        <w:t>-- разбирает CHECK и молча игнорирует, и тогда половина ограничений задания</w:t>
+      </w:r>
+    </w:p>
+    <w:p>
+      <w:pPr>
+        <w:spacing w:line="240" w:lineRule="auto" w:before="0" w:after="0"/>
+        <w:ind w:firstLine="0" w:left="0"/>
+        <w:jc w:val="left"/>
+      </w:pPr>
+      <w:r>
+        <w:rPr>
+          <w:rFonts w:ascii="Courier New" w:hAnsi="Courier New" w:eastAsia="Courier New"/>
+          <w:sz w:val="18"/>
+        </w:rPr>
+        <w:t>-- работать не будет.</w:t>
       </w:r>
     </w:p>
     <w:p>
@@ -1549,6 +1591,61 @@
           <w:rFonts w:ascii="Courier New" w:hAnsi="Courier New" w:eastAsia="Courier New"/>
           <w:sz w:val="18"/>
         </w:rPr>
+        <w:t>-- Клиент должен читать этот файл как UTF-8, иначе кириллица в имени базы</w:t>
+      </w:r>
+    </w:p>
+    <w:p>
+      <w:pPr>
+        <w:spacing w:line="240" w:lineRule="auto" w:before="0" w:after="0"/>
+        <w:ind w:firstLine="0" w:left="0"/>
+        <w:jc w:val="left"/>
+      </w:pPr>
+      <w:r>
+        <w:rPr>
+          <w:rFonts w:ascii="Courier New" w:hAnsi="Courier New" w:eastAsia="Courier New"/>
+          <w:sz w:val="18"/>
+        </w:rPr>
+        <w:t>-- развалится и CREATE DATABASE упадёт с ошибкой синтаксиса.</w:t>
+      </w:r>
+    </w:p>
+    <w:p>
+      <w:pPr>
+        <w:spacing w:line="240" w:lineRule="auto" w:before="0" w:after="0"/>
+        <w:ind w:firstLine="0" w:left="0"/>
+        <w:jc w:val="left"/>
+      </w:pPr>
+      <w:r>
+        <w:rPr>
+          <w:rFonts w:ascii="Courier New" w:hAnsi="Courier New" w:eastAsia="Courier New"/>
+          <w:sz w:val="18"/>
+        </w:rPr>
+        <w:t>SET NAMES utf8mb4;</w:t>
+      </w:r>
+    </w:p>
+    <w:p>
+      <w:pPr>
+        <w:spacing w:line="240" w:lineRule="auto" w:before="0" w:after="0"/>
+        <w:ind w:firstLine="0" w:left="0"/>
+        <w:jc w:val="left"/>
+      </w:pPr>
+      <w:r>
+        <w:rPr>
+          <w:rFonts w:ascii="Courier New" w:hAnsi="Courier New" w:eastAsia="Courier New"/>
+          <w:sz w:val="18"/>
+        </w:rPr>
+      </w:r>
+    </w:p>
+    <w:p>
+      <w:pPr>
+        <w:spacing w:line="240" w:lineRule="auto" w:before="0" w:after="0"/>
+        <w:ind w:firstLine="0" w:left="0"/>
+        <w:jc w:val="left"/>
+      </w:pPr>
+      <w:r>
+        <w:rPr>
+          <w:rFonts w:ascii="Courier New" w:hAnsi="Courier New" w:eastAsia="Courier New"/>
+          <w:sz w:val="18"/>
+        </w:rPr>
         <w:t>DROP DATABASE IF EXISTS torgash_Холкин;</w:t>
       </w:r>
     </w:p>
@@ -1563,7 +1660,7 @@
           <w:rFonts w:ascii="Courier New" w:hAnsi="Courier New" w:eastAsia="Courier New"/>
           <w:sz w:val="18"/>
         </w:rPr>
-        <w:t>CREATE DATABASE torgash_Холкин CHARACTER SET utf8mb4 COLLATE utf8mb4_unicode_ci;</w:t>
+        <w:t>CREATE DATABASE torgash_Холкин CHARACTER SET utf8mb4 COLLATE utf8mb4_general_ci;</w:t>
       </w:r>
     </w:p>
     <w:p>
@@ -5068,6 +5165,33 @@
           <w:rFonts w:ascii="Courier New" w:hAnsi="Courier New" w:eastAsia="Courier New"/>
           <w:sz w:val="18"/>
         </w:rPr>
+        <w:t>SET NAMES utf8mb4;</w:t>
+      </w:r>
+    </w:p>
+    <w:p>
+      <w:pPr>
+        <w:spacing w:line="240" w:lineRule="auto" w:before="0" w:after="0"/>
+        <w:ind w:firstLine="0" w:left="0"/>
+        <w:jc w:val="left"/>
+      </w:pPr>
+      <w:r>
+        <w:rPr>
+          <w:rFonts w:ascii="Courier New" w:hAnsi="Courier New" w:eastAsia="Courier New"/>
+          <w:sz w:val="18"/>
+        </w:rPr>
+      </w:r>
+    </w:p>
+    <w:p>
+      <w:pPr>
+        <w:spacing w:line="240" w:lineRule="auto" w:before="0" w:after="0"/>
+        <w:ind w:firstLine="0" w:left="0"/>
+        <w:jc w:val="left"/>
+      </w:pPr>
+      <w:r>
+        <w:rPr>
+          <w:rFonts w:ascii="Courier New" w:hAnsi="Courier New" w:eastAsia="Courier New"/>
+          <w:sz w:val="18"/>
+        </w:rPr>
         <w:t>USE torgash_Холкин;</w:t>
       </w:r>
     </w:p>
@@ -5204,6 +5328,34 @@
           <w:rFonts w:ascii="Courier New" w:hAnsi="Courier New" w:eastAsia="Courier New"/>
           <w:sz w:val="18"/>
         </w:rPr>
+        <w:t>-- Дата проставляется триггером ниже, а не значением по умолчанию: с</w:t>
+      </w:r>
+    </w:p>
+    <w:p>
+      <w:pPr>
+        <w:spacing w:line="240" w:lineRule="auto" w:before="0" w:after="0"/>
+        <w:ind w:firstLine="0" w:left="0"/>
+        <w:jc w:val="left"/>
+      </w:pPr>
+      <w:r>
+        <w:rPr>
+          <w:rFonts w:ascii="Courier New" w:hAnsi="Courier New" w:eastAsia="Courier New"/>
+          <w:sz w:val="18"/>
+        </w:rPr>
+        <w:t>-- DEFAULT (CURRENT_DATE) при вставке записывалось 0000-00-00.</w:t>
+      </w:r>
+    </w:p>
+    <w:p>
+      <w:pPr>
+        <w:spacing w:line="240" w:lineRule="auto" w:before="0" w:after="0"/>
+        <w:ind w:firstLine="0" w:left="0"/>
+        <w:jc w:val="left"/>
+      </w:pPr>
+      <w:r>
+        <w:rPr>
+          <w:rFonts w:ascii="Courier New" w:hAnsi="Courier New" w:eastAsia="Courier New"/>
+          <w:sz w:val="18"/>
+        </w:rPr>
         <w:t>ALTER TABLE salespeople</w:t>
       </w:r>
     </w:p>
@@ -5218,7 +5370,34 @@
           <w:rFonts w:ascii="Courier New" w:hAnsi="Courier New" w:eastAsia="Courier New"/>
           <w:sz w:val="18"/>
         </w:rPr>
-        <w:t xml:space="preserve">    ADD COLUMN data_reg DATE NOT NULL DEFAULT (CURRENT_DATE) AFTER naprav;</w:t>
+        <w:t xml:space="preserve">    ADD COLUMN data_reg DATE NULL AFTER naprav;</w:t>
+      </w:r>
+    </w:p>
+    <w:p>
+      <w:pPr>
+        <w:spacing w:line="240" w:lineRule="auto" w:before="0" w:after="0"/>
+        <w:ind w:firstLine="0" w:left="0"/>
+        <w:jc w:val="left"/>
+      </w:pPr>
+      <w:r>
+        <w:rPr>
+          <w:rFonts w:ascii="Courier New" w:hAnsi="Courier New" w:eastAsia="Courier New"/>
+          <w:sz w:val="18"/>
+        </w:rPr>
+      </w:r>
+    </w:p>
+    <w:p>
+      <w:pPr>
+        <w:spacing w:line="240" w:lineRule="auto" w:before="0" w:after="0"/>
+        <w:ind w:firstLine="0" w:left="0"/>
+        <w:jc w:val="left"/>
+      </w:pPr>
+      <w:r>
+        <w:rPr>
+          <w:rFonts w:ascii="Courier New" w:hAnsi="Courier New" w:eastAsia="Courier New"/>
+          <w:sz w:val="18"/>
+        </w:rPr>
+        <w:t>UPDATE salespeople SET data_reg = CURDATE() WHERE data_reg IS NULL;</w:t>
       </w:r>
     </w:p>
     <w:p>
@@ -5327,6 +5506,145 @@
           <w:rFonts w:ascii="Courier New" w:hAnsi="Courier New" w:eastAsia="Courier New"/>
           <w:sz w:val="18"/>
         </w:rPr>
+        <w:t>DROP TRIGGER IF EXISTS salespeople_before_insert;</w:t>
+      </w:r>
+    </w:p>
+    <w:p>
+      <w:pPr>
+        <w:spacing w:line="240" w:lineRule="auto" w:before="0" w:after="0"/>
+        <w:ind w:firstLine="0" w:left="0"/>
+        <w:jc w:val="left"/>
+      </w:pPr>
+      <w:r>
+        <w:rPr>
+          <w:rFonts w:ascii="Courier New" w:hAnsi="Courier New" w:eastAsia="Courier New"/>
+          <w:sz w:val="18"/>
+        </w:rPr>
+        <w:t>DELIMITER $$</w:t>
+      </w:r>
+    </w:p>
+    <w:p>
+      <w:pPr>
+        <w:spacing w:line="240" w:lineRule="auto" w:before="0" w:after="0"/>
+        <w:ind w:firstLine="0" w:left="0"/>
+        <w:jc w:val="left"/>
+      </w:pPr>
+      <w:r>
+        <w:rPr>
+          <w:rFonts w:ascii="Courier New" w:hAnsi="Courier New" w:eastAsia="Courier New"/>
+          <w:sz w:val="18"/>
+        </w:rPr>
+        <w:t>CREATE TRIGGER salespeople_before_insert</w:t>
+      </w:r>
+    </w:p>
+    <w:p>
+      <w:pPr>
+        <w:spacing w:line="240" w:lineRule="auto" w:before="0" w:after="0"/>
+        <w:ind w:firstLine="0" w:left="0"/>
+        <w:jc w:val="left"/>
+      </w:pPr>
+      <w:r>
+        <w:rPr>
+          <w:rFonts w:ascii="Courier New" w:hAnsi="Courier New" w:eastAsia="Courier New"/>
+          <w:sz w:val="18"/>
+        </w:rPr>
+        <w:t>BEFORE INSERT ON salespeople</w:t>
+      </w:r>
+    </w:p>
+    <w:p>
+      <w:pPr>
+        <w:spacing w:line="240" w:lineRule="auto" w:before="0" w:after="0"/>
+        <w:ind w:firstLine="0" w:left="0"/>
+        <w:jc w:val="left"/>
+      </w:pPr>
+      <w:r>
+        <w:rPr>
+          <w:rFonts w:ascii="Courier New" w:hAnsi="Courier New" w:eastAsia="Courier New"/>
+          <w:sz w:val="18"/>
+        </w:rPr>
+        <w:t>FOR EACH ROW</w:t>
+      </w:r>
+    </w:p>
+    <w:p>
+      <w:pPr>
+        <w:spacing w:line="240" w:lineRule="auto" w:before="0" w:after="0"/>
+        <w:ind w:firstLine="0" w:left="0"/>
+        <w:jc w:val="left"/>
+      </w:pPr>
+      <w:r>
+        <w:rPr>
+          <w:rFonts w:ascii="Courier New" w:hAnsi="Courier New" w:eastAsia="Courier New"/>
+          <w:sz w:val="18"/>
+        </w:rPr>
+        <w:t>BEGIN</w:t>
+      </w:r>
+    </w:p>
+    <w:p>
+      <w:pPr>
+        <w:spacing w:line="240" w:lineRule="auto" w:before="0" w:after="0"/>
+        <w:ind w:firstLine="0" w:left="0"/>
+        <w:jc w:val="left"/>
+      </w:pPr>
+      <w:r>
+        <w:rPr>
+          <w:rFonts w:ascii="Courier New" w:hAnsi="Courier New" w:eastAsia="Courier New"/>
+          <w:sz w:val="18"/>
+        </w:rPr>
+        <w:t xml:space="preserve">    SET NEW.data_reg = CURDATE();</w:t>
+      </w:r>
+    </w:p>
+    <w:p>
+      <w:pPr>
+        <w:spacing w:line="240" w:lineRule="auto" w:before="0" w:after="0"/>
+        <w:ind w:firstLine="0" w:left="0"/>
+        <w:jc w:val="left"/>
+      </w:pPr>
+      <w:r>
+        <w:rPr>
+          <w:rFonts w:ascii="Courier New" w:hAnsi="Courier New" w:eastAsia="Courier New"/>
+          <w:sz w:val="18"/>
+        </w:rPr>
+        <w:t>END$$</w:t>
+      </w:r>
+    </w:p>
+    <w:p>
+      <w:pPr>
+        <w:spacing w:line="240" w:lineRule="auto" w:before="0" w:after="0"/>
+        <w:ind w:firstLine="0" w:left="0"/>
+        <w:jc w:val="left"/>
+      </w:pPr>
+      <w:r>
+        <w:rPr>
+          <w:rFonts w:ascii="Courier New" w:hAnsi="Courier New" w:eastAsia="Courier New"/>
+          <w:sz w:val="18"/>
+        </w:rPr>
+        <w:t>DELIMITER ;</w:t>
+      </w:r>
+    </w:p>
+    <w:p>
+      <w:pPr>
+        <w:spacing w:line="240" w:lineRule="auto" w:before="0" w:after="0"/>
+        <w:ind w:firstLine="0" w:left="0"/>
+        <w:jc w:val="left"/>
+      </w:pPr>
+      <w:r>
+        <w:rPr>
+          <w:rFonts w:ascii="Courier New" w:hAnsi="Courier New" w:eastAsia="Courier New"/>
+          <w:sz w:val="18"/>
+        </w:rPr>
+      </w:r>
+    </w:p>
+    <w:p>
+      <w:pPr>
+        <w:spacing w:line="240" w:lineRule="auto" w:before="0" w:after="0"/>
+        <w:ind w:firstLine="0" w:left="0"/>
+        <w:jc w:val="left"/>
+      </w:pPr>
+      <w:r>
+        <w:rPr>
+          <w:rFonts w:ascii="Courier New" w:hAnsi="Courier New" w:eastAsia="Courier New"/>
+          <w:sz w:val="18"/>
+        </w:rPr>
         <w:t>DROP TRIGGER IF EXISTS salespeople_before_update;</w:t>
       </w:r>
     </w:p>
@@ -5659,35 +5977,49 @@
           <w:rFonts w:ascii="Courier New" w:hAnsi="Courier New" w:eastAsia="Courier New"/>
           <w:sz w:val="18"/>
         </w:rPr>
-        <w:t>-- --- 5. Возраст при вставке и сообщение о пенсионном возрасте ---------------</w:t>
-      </w:r>
-    </w:p>
-    <w:p>
-      <w:pPr>
-        <w:spacing w:line="240" w:lineRule="auto" w:before="0" w:after="0"/>
-        <w:ind w:firstLine="0" w:left="0"/>
-        <w:jc w:val="left"/>
-      </w:pPr>
-      <w:r>
-        <w:rPr>
-          <w:rFonts w:ascii="Courier New" w:hAnsi="Courier New" w:eastAsia="Courier New"/>
-          <w:sz w:val="18"/>
-        </w:rPr>
-        <w:t>-- SQLSTATE '01000' это предупреждение: строка вставляется, а сообщение</w:t>
-      </w:r>
-    </w:p>
-    <w:p>
-      <w:pPr>
-        <w:spacing w:line="240" w:lineRule="auto" w:before="0" w:after="0"/>
-        <w:ind w:firstLine="0" w:left="0"/>
-        <w:jc w:val="left"/>
-      </w:pPr>
-      <w:r>
-        <w:rPr>
-          <w:rFonts w:ascii="Courier New" w:hAnsi="Courier New" w:eastAsia="Courier New"/>
-          <w:sz w:val="18"/>
-        </w:rPr>
-        <w:t>-- показывается через SHOW WARNINGS. Код '45000' прервал бы вставку.</w:t>
+        <w:t>-- --- 5. Возраст при вставке и отказ пенсионному возрасту --------------------</w:t>
+      </w:r>
+    </w:p>
+    <w:p>
+      <w:pPr>
+        <w:spacing w:line="240" w:lineRule="auto" w:before="0" w:after="0"/>
+        <w:ind w:firstLine="0" w:left="0"/>
+        <w:jc w:val="left"/>
+      </w:pPr>
+      <w:r>
+        <w:rPr>
+          <w:rFonts w:ascii="Courier New" w:hAnsi="Courier New" w:eastAsia="Courier New"/>
+          <w:sz w:val="18"/>
+        </w:rPr>
+        <w:t>-- Оба кода '45000': заказчик младше 18 и старше 65 не принимается. Код '01000'</w:t>
+      </w:r>
+    </w:p>
+    <w:p>
+      <w:pPr>
+        <w:spacing w:line="240" w:lineRule="auto" w:before="0" w:after="0"/>
+        <w:ind w:firstLine="0" w:left="0"/>
+        <w:jc w:val="left"/>
+      </w:pPr>
+      <w:r>
+        <w:rPr>
+          <w:rFonts w:ascii="Courier New" w:hAnsi="Courier New" w:eastAsia="Courier New"/>
+          <w:sz w:val="18"/>
+        </w:rPr>
+        <w:t>-- это предупреждение, с ним строка всё равно вставлялась, и на защите пришлось</w:t>
+      </w:r>
+    </w:p>
+    <w:p>
+      <w:pPr>
+        <w:spacing w:line="240" w:lineRule="auto" w:before="0" w:after="0"/>
+        <w:ind w:firstLine="0" w:left="0"/>
+        <w:jc w:val="left"/>
+      </w:pPr>
+      <w:r>
+        <w:rPr>
+          <w:rFonts w:ascii="Courier New" w:hAnsi="Courier New" w:eastAsia="Courier New"/>
+          <w:sz w:val="18"/>
+        </w:rPr>
+        <w:t>-- менять его на '45000'.</w:t>
       </w:r>
     </w:p>
     <w:p>
@@ -5894,7 +6226,7 @@
           <w:rFonts w:ascii="Courier New" w:hAnsi="Courier New" w:eastAsia="Courier New"/>
           <w:sz w:val="18"/>
         </w:rPr>
-        <w:t xml:space="preserve">        SIGNAL SQLSTATE '01000' SET MESSAGE_TEXT = 'Заказчик пенсионного возраста';</w:t>
+        <w:t xml:space="preserve">        SIGNAL SQLSTATE '45000' SET MESSAGE_TEXT = 'Заказчик пенсионного возраста';</w:t>
       </w:r>
     </w:p>
     <w:p>
@@ -6570,90 +6902,104 @@
           <w:rFonts w:ascii="Courier New" w:hAnsi="Courier New" w:eastAsia="Courier New"/>
           <w:sz w:val="18"/>
         </w:rPr>
-        <w:t>-- Проверка сообщения о пенсионном возрасте: строка вставится, предупреждение</w:t>
-      </w:r>
-    </w:p>
-    <w:p>
-      <w:pPr>
-        <w:spacing w:line="240" w:lineRule="auto" w:before="0" w:after="0"/>
-        <w:ind w:firstLine="0" w:left="0"/>
-        <w:jc w:val="left"/>
-      </w:pPr>
-      <w:r>
-        <w:rPr>
-          <w:rFonts w:ascii="Courier New" w:hAnsi="Courier New" w:eastAsia="Courier New"/>
-          <w:sz w:val="18"/>
-        </w:rPr>
-        <w:t>-- покажет SHOW WARNINGS.</w:t>
-      </w:r>
-    </w:p>
-    <w:p>
-      <w:pPr>
-        <w:spacing w:line="240" w:lineRule="auto" w:before="0" w:after="0"/>
-        <w:ind w:firstLine="0" w:left="0"/>
-        <w:jc w:val="left"/>
-      </w:pPr>
-      <w:r>
-        <w:rPr>
-          <w:rFonts w:ascii="Courier New" w:hAnsi="Courier New" w:eastAsia="Courier New"/>
-          <w:sz w:val="18"/>
-        </w:rPr>
-        <w:t>INSERT INTO customers_fiz (name, city, pol, gr)</w:t>
-      </w:r>
-    </w:p>
-    <w:p>
-      <w:pPr>
-        <w:spacing w:line="240" w:lineRule="auto" w:before="0" w:after="0"/>
-        <w:ind w:firstLine="0" w:left="0"/>
-        <w:jc w:val="left"/>
-      </w:pPr>
-      <w:r>
-        <w:rPr>
-          <w:rFonts w:ascii="Courier New" w:hAnsi="Courier New" w:eastAsia="Courier New"/>
-          <w:sz w:val="18"/>
-        </w:rPr>
-        <w:t>VALUES ('Петров А.А.', 'Казань', 'м', '1955-04-11');</w:t>
-      </w:r>
-    </w:p>
-    <w:p>
-      <w:pPr>
-        <w:spacing w:line="240" w:lineRule="auto" w:before="0" w:after="0"/>
-        <w:ind w:firstLine="0" w:left="0"/>
-        <w:jc w:val="left"/>
-      </w:pPr>
-      <w:r>
-        <w:rPr>
-          <w:rFonts w:ascii="Courier New" w:hAnsi="Courier New" w:eastAsia="Courier New"/>
-          <w:sz w:val="18"/>
-        </w:rPr>
-        <w:t>SHOW WARNINGS;</w:t>
-      </w:r>
-    </w:p>
-    <w:p>
-      <w:pPr>
-        <w:spacing w:line="240" w:lineRule="auto" w:before="0" w:after="0"/>
-        <w:ind w:firstLine="0" w:left="0"/>
-        <w:jc w:val="left"/>
-      </w:pPr>
-      <w:r>
-        <w:rPr>
-          <w:rFonts w:ascii="Courier New" w:hAnsi="Courier New" w:eastAsia="Courier New"/>
-          <w:sz w:val="18"/>
-        </w:rPr>
-      </w:r>
-    </w:p>
-    <w:p>
-      <w:pPr>
-        <w:spacing w:line="240" w:lineRule="auto" w:before="0" w:after="0"/>
-        <w:ind w:firstLine="0" w:left="0"/>
-        <w:jc w:val="left"/>
-      </w:pPr>
-      <w:r>
-        <w:rPr>
-          <w:rFonts w:ascii="Courier New" w:hAnsi="Courier New" w:eastAsia="Courier New"/>
-          <w:sz w:val="18"/>
-        </w:rPr>
-        <w:t>SELECT id_cf, name, vozrast FROM customers_fiz WHERE vozrast &gt; 65;</w:t>
+        <w:t>-- Проверка отказов: обе вставки должны завершиться ошибкой, это и есть</w:t>
+      </w:r>
+    </w:p>
+    <w:p>
+      <w:pPr>
+        <w:spacing w:line="240" w:lineRule="auto" w:before="0" w:after="0"/>
+        <w:ind w:firstLine="0" w:left="0"/>
+        <w:jc w:val="left"/>
+      </w:pPr>
+      <w:r>
+        <w:rPr>
+          <w:rFonts w:ascii="Courier New" w:hAnsi="Courier New" w:eastAsia="Courier New"/>
+          <w:sz w:val="18"/>
+        </w:rPr>
+        <w:t>-- ожидаемое поведение.</w:t>
+      </w:r>
+    </w:p>
+    <w:p>
+      <w:pPr>
+        <w:spacing w:line="240" w:lineRule="auto" w:before="0" w:after="0"/>
+        <w:ind w:firstLine="0" w:left="0"/>
+        <w:jc w:val="left"/>
+      </w:pPr>
+      <w:r>
+        <w:rPr>
+          <w:rFonts w:ascii="Courier New" w:hAnsi="Courier New" w:eastAsia="Courier New"/>
+          <w:sz w:val="18"/>
+        </w:rPr>
+        <w:t>-- INSERT INTO customers_fiz (name, city, pol, gr)</w:t>
+      </w:r>
+    </w:p>
+    <w:p>
+      <w:pPr>
+        <w:spacing w:line="240" w:lineRule="auto" w:before="0" w:after="0"/>
+        <w:ind w:firstLine="0" w:left="0"/>
+        <w:jc w:val="left"/>
+      </w:pPr>
+      <w:r>
+        <w:rPr>
+          <w:rFonts w:ascii="Courier New" w:hAnsi="Courier New" w:eastAsia="Courier New"/>
+          <w:sz w:val="18"/>
+        </w:rPr>
+        <w:t>-- VALUES ('Петров А.А.', 'Казань', 'м', '1955-04-11');   -- старше 65</w:t>
+      </w:r>
+    </w:p>
+    <w:p>
+      <w:pPr>
+        <w:spacing w:line="240" w:lineRule="auto" w:before="0" w:after="0"/>
+        <w:ind w:firstLine="0" w:left="0"/>
+        <w:jc w:val="left"/>
+      </w:pPr>
+      <w:r>
+        <w:rPr>
+          <w:rFonts w:ascii="Courier New" w:hAnsi="Courier New" w:eastAsia="Courier New"/>
+          <w:sz w:val="18"/>
+        </w:rPr>
+        <w:t>-- INSERT INTO customers_fiz (name, city, pol, gr)</w:t>
+      </w:r>
+    </w:p>
+    <w:p>
+      <w:pPr>
+        <w:spacing w:line="240" w:lineRule="auto" w:before="0" w:after="0"/>
+        <w:ind w:firstLine="0" w:left="0"/>
+        <w:jc w:val="left"/>
+      </w:pPr>
+      <w:r>
+        <w:rPr>
+          <w:rFonts w:ascii="Courier New" w:hAnsi="Courier New" w:eastAsia="Courier New"/>
+          <w:sz w:val="18"/>
+        </w:rPr>
+        <w:t>-- VALUES ('Юнов Ю.Ю.', 'Казань', 'м', '2015-04-11');     -- младше 18</w:t>
+      </w:r>
+    </w:p>
+    <w:p>
+      <w:pPr>
+        <w:spacing w:line="240" w:lineRule="auto" w:before="0" w:after="0"/>
+        <w:ind w:firstLine="0" w:left="0"/>
+        <w:jc w:val="left"/>
+      </w:pPr>
+      <w:r>
+        <w:rPr>
+          <w:rFonts w:ascii="Courier New" w:hAnsi="Courier New" w:eastAsia="Courier New"/>
+          <w:sz w:val="18"/>
+        </w:rPr>
+      </w:r>
+    </w:p>
+    <w:p>
+      <w:pPr>
+        <w:spacing w:line="240" w:lineRule="auto" w:before="0" w:after="0"/>
+        <w:ind w:firstLine="0" w:left="0"/>
+        <w:jc w:val="left"/>
+      </w:pPr>
+      <w:r>
+        <w:rPr>
+          <w:rFonts w:ascii="Courier New" w:hAnsi="Courier New" w:eastAsia="Courier New"/>
+          <w:sz w:val="18"/>
+        </w:rPr>
+        <w:t>SELECT id_s, snazv, data_reg FROM salespeople ORDER BY id_s;</w:t>
       </w:r>
     </w:p>
     <w:p>

</xml_diff>